<commit_message>
Content v2 integrated: Industry (v7 text, industry GLA base), Financial Analysis (v2 text, annexes 9-14, wide capex/maturity figures), Valuation (new text, annexes 15-18 with breakdown, tie-out, debt schedule, review sensitivities); figures data from model v4
Co-Authored-By: Claude Sonnet 5.5 <noreply@anthropic.com>
Claude-Session: https://claude.ai/code/session_0188QZHBkA8n5QL7BtmFakQg
</commit_message>
<xml_diff>
--- a/secciones/analisis_financiero/documento/Mallplaza_Analisis_Financiero_EN.docx
+++ b/secciones/analisis_financiero/documento/Mallplaza_Analisis_Financiero_EN.docx
@@ -61,7 +61,7 @@
           <w:sz w:val="14"/>
           <w:szCs w:val="14"/>
         </w:rPr>
-        <w:t xml:space="preserve">Normalized ROE of 8–10% is the real return; reported ROE is appraisal-driven</w:t>
+        <w:t xml:space="preserve">ROE on distributable profit of 8–10% (not the shareholder's return); reported ROE follows the appraisal</w:t>
       </w:r>
     </w:p>
     <w:tbl>
@@ -778,115 +778,115 @@
                 <w:sz w:val="12"/>
                 <w:szCs w:val="12"/>
               </w:rPr>
-              <w:t xml:space="preserve">821</w:t>
-            </w:r>
-          </w:p>
-        </w:tc>
-        <w:tc>
-          <w:tcPr>
-            <w:tcW w:type="dxa" w:w="840"/>
-            <w:tcBorders>
-              <w:top w:val="none" w:color="FFFFFF" w:sz="0"/>
-              <w:left w:val="none" w:color="FFFFFF" w:sz="0"/>
-              <w:bottom w:val="single" w:color="D5D9E0" w:sz="4"/>
-              <w:right w:val="none" w:color="FFFFFF" w:sz="0"/>
-            </w:tcBorders>
-            <w:shd w:fill="F7F8FB" w:color="auto" w:val="clear"/>
-            <w:tcMar>
-              <w:top w:type="dxa" w:w="18"/>
-              <w:left w:type="dxa" w:w="60"/>
-              <w:bottom w:type="dxa" w:w="18"/>
-              <w:right w:type="dxa" w:w="60"/>
-            </w:tcMar>
-            <w:vAlign w:val="center"/>
-          </w:tcPr>
-          <w:p>
-            <w:pPr>
-              <w:spacing w:line="204" w:lineRule="auto"/>
-              <w:jc w:val="right"/>
-            </w:pPr>
-            <w:r>
-              <w:rPr>
-                <w:rFonts w:ascii="Arial" w:cs="Arial" w:eastAsia="Arial" w:hAnsi="Arial"/>
-                <w:b w:val="false"/>
-                <w:bCs w:val="false"/>
-                <w:color w:val="1A1A1A"/>
-                <w:sz w:val="12"/>
-                <w:szCs w:val="12"/>
-              </w:rPr>
-              <w:t xml:space="preserve">870</w:t>
-            </w:r>
-          </w:p>
-        </w:tc>
-        <w:tc>
-          <w:tcPr>
-            <w:tcW w:type="dxa" w:w="840"/>
-            <w:tcBorders>
-              <w:top w:val="none" w:color="FFFFFF" w:sz="0"/>
-              <w:left w:val="none" w:color="FFFFFF" w:sz="0"/>
-              <w:bottom w:val="single" w:color="D5D9E0" w:sz="4"/>
-              <w:right w:val="none" w:color="FFFFFF" w:sz="0"/>
-            </w:tcBorders>
-            <w:shd w:fill="F7F8FB" w:color="auto" w:val="clear"/>
-            <w:tcMar>
-              <w:top w:type="dxa" w:w="18"/>
-              <w:left w:type="dxa" w:w="60"/>
-              <w:bottom w:type="dxa" w:w="18"/>
-              <w:right w:type="dxa" w:w="60"/>
-            </w:tcMar>
-            <w:vAlign w:val="center"/>
-          </w:tcPr>
-          <w:p>
-            <w:pPr>
-              <w:spacing w:line="204" w:lineRule="auto"/>
-              <w:jc w:val="right"/>
-            </w:pPr>
-            <w:r>
-              <w:rPr>
-                <w:rFonts w:ascii="Arial" w:cs="Arial" w:eastAsia="Arial" w:hAnsi="Arial"/>
-                <w:b w:val="false"/>
-                <w:bCs w:val="false"/>
-                <w:color w:val="1A1A1A"/>
-                <w:sz w:val="12"/>
-                <w:szCs w:val="12"/>
-              </w:rPr>
-              <w:t xml:space="preserve">916</w:t>
-            </w:r>
-          </w:p>
-        </w:tc>
-        <w:tc>
-          <w:tcPr>
-            <w:tcW w:type="dxa" w:w="840"/>
-            <w:tcBorders>
-              <w:top w:val="none" w:color="FFFFFF" w:sz="0"/>
-              <w:left w:val="none" w:color="FFFFFF" w:sz="0"/>
-              <w:bottom w:val="single" w:color="D5D9E0" w:sz="4"/>
-              <w:right w:val="none" w:color="FFFFFF" w:sz="0"/>
-            </w:tcBorders>
-            <w:shd w:fill="F7F8FB" w:color="auto" w:val="clear"/>
-            <w:tcMar>
-              <w:top w:type="dxa" w:w="18"/>
-              <w:left w:type="dxa" w:w="60"/>
-              <w:bottom w:type="dxa" w:w="18"/>
-              <w:right w:type="dxa" w:w="60"/>
-            </w:tcMar>
-            <w:vAlign w:val="center"/>
-          </w:tcPr>
-          <w:p>
-            <w:pPr>
-              <w:spacing w:line="204" w:lineRule="auto"/>
-              <w:jc w:val="right"/>
-            </w:pPr>
-            <w:r>
-              <w:rPr>
-                <w:rFonts w:ascii="Arial" w:cs="Arial" w:eastAsia="Arial" w:hAnsi="Arial"/>
-                <w:b w:val="false"/>
-                <w:bCs w:val="false"/>
-                <w:color w:val="1A1A1A"/>
-                <w:sz w:val="12"/>
-                <w:szCs w:val="12"/>
-              </w:rPr>
-              <w:t xml:space="preserve">961</w:t>
+              <w:t xml:space="preserve">827</w:t>
+            </w:r>
+          </w:p>
+        </w:tc>
+        <w:tc>
+          <w:tcPr>
+            <w:tcW w:type="dxa" w:w="840"/>
+            <w:tcBorders>
+              <w:top w:val="none" w:color="FFFFFF" w:sz="0"/>
+              <w:left w:val="none" w:color="FFFFFF" w:sz="0"/>
+              <w:bottom w:val="single" w:color="D5D9E0" w:sz="4"/>
+              <w:right w:val="none" w:color="FFFFFF" w:sz="0"/>
+            </w:tcBorders>
+            <w:shd w:fill="F7F8FB" w:color="auto" w:val="clear"/>
+            <w:tcMar>
+              <w:top w:type="dxa" w:w="18"/>
+              <w:left w:type="dxa" w:w="60"/>
+              <w:bottom w:type="dxa" w:w="18"/>
+              <w:right w:type="dxa" w:w="60"/>
+            </w:tcMar>
+            <w:vAlign w:val="center"/>
+          </w:tcPr>
+          <w:p>
+            <w:pPr>
+              <w:spacing w:line="204" w:lineRule="auto"/>
+              <w:jc w:val="right"/>
+            </w:pPr>
+            <w:r>
+              <w:rPr>
+                <w:rFonts w:ascii="Arial" w:cs="Arial" w:eastAsia="Arial" w:hAnsi="Arial"/>
+                <w:b w:val="false"/>
+                <w:bCs w:val="false"/>
+                <w:color w:val="1A1A1A"/>
+                <w:sz w:val="12"/>
+                <w:szCs w:val="12"/>
+              </w:rPr>
+              <w:t xml:space="preserve">887</w:t>
+            </w:r>
+          </w:p>
+        </w:tc>
+        <w:tc>
+          <w:tcPr>
+            <w:tcW w:type="dxa" w:w="840"/>
+            <w:tcBorders>
+              <w:top w:val="none" w:color="FFFFFF" w:sz="0"/>
+              <w:left w:val="none" w:color="FFFFFF" w:sz="0"/>
+              <w:bottom w:val="single" w:color="D5D9E0" w:sz="4"/>
+              <w:right w:val="none" w:color="FFFFFF" w:sz="0"/>
+            </w:tcBorders>
+            <w:shd w:fill="F7F8FB" w:color="auto" w:val="clear"/>
+            <w:tcMar>
+              <w:top w:type="dxa" w:w="18"/>
+              <w:left w:type="dxa" w:w="60"/>
+              <w:bottom w:type="dxa" w:w="18"/>
+              <w:right w:type="dxa" w:w="60"/>
+            </w:tcMar>
+            <w:vAlign w:val="center"/>
+          </w:tcPr>
+          <w:p>
+            <w:pPr>
+              <w:spacing w:line="204" w:lineRule="auto"/>
+              <w:jc w:val="right"/>
+            </w:pPr>
+            <w:r>
+              <w:rPr>
+                <w:rFonts w:ascii="Arial" w:cs="Arial" w:eastAsia="Arial" w:hAnsi="Arial"/>
+                <w:b w:val="false"/>
+                <w:bCs w:val="false"/>
+                <w:color w:val="1A1A1A"/>
+                <w:sz w:val="12"/>
+                <w:szCs w:val="12"/>
+              </w:rPr>
+              <w:t xml:space="preserve">936</w:t>
+            </w:r>
+          </w:p>
+        </w:tc>
+        <w:tc>
+          <w:tcPr>
+            <w:tcW w:type="dxa" w:w="840"/>
+            <w:tcBorders>
+              <w:top w:val="none" w:color="FFFFFF" w:sz="0"/>
+              <w:left w:val="none" w:color="FFFFFF" w:sz="0"/>
+              <w:bottom w:val="single" w:color="D5D9E0" w:sz="4"/>
+              <w:right w:val="none" w:color="FFFFFF" w:sz="0"/>
+            </w:tcBorders>
+            <w:shd w:fill="F7F8FB" w:color="auto" w:val="clear"/>
+            <w:tcMar>
+              <w:top w:type="dxa" w:w="18"/>
+              <w:left w:type="dxa" w:w="60"/>
+              <w:bottom w:type="dxa" w:w="18"/>
+              <w:right w:type="dxa" w:w="60"/>
+            </w:tcMar>
+            <w:vAlign w:val="center"/>
+          </w:tcPr>
+          <w:p>
+            <w:pPr>
+              <w:spacing w:line="204" w:lineRule="auto"/>
+              <w:jc w:val="right"/>
+            </w:pPr>
+            <w:r>
+              <w:rPr>
+                <w:rFonts w:ascii="Arial" w:cs="Arial" w:eastAsia="Arial" w:hAnsi="Arial"/>
+                <w:b w:val="false"/>
+                <w:bCs w:val="false"/>
+                <w:color w:val="1A1A1A"/>
+                <w:sz w:val="12"/>
+                <w:szCs w:val="12"/>
+              </w:rPr>
+              <w:t xml:space="preserve">982</w:t>
             </w:r>
           </w:p>
         </w:tc>
@@ -1616,7 +1616,7 @@
                 <w:sz w:val="12"/>
                 <w:szCs w:val="12"/>
               </w:rPr>
-              <w:t xml:space="preserve">55.3</w:t>
+              <w:t xml:space="preserve">55.4</w:t>
             </w:r>
           </w:p>
         </w:tc>
@@ -1945,7 +1945,7 @@
                 <w:sz w:val="12"/>
                 <w:szCs w:val="12"/>
               </w:rPr>
-              <w:t xml:space="preserve">592</w:t>
+              <w:t xml:space="preserve">591</w:t>
             </w:r>
           </w:p>
         </w:tc>
@@ -1981,7 +1981,7 @@
                 <w:sz w:val="12"/>
                 <w:szCs w:val="12"/>
               </w:rPr>
-              <w:t xml:space="preserve">610</w:t>
+              <w:t xml:space="preserve">614</w:t>
             </w:r>
           </w:p>
         </w:tc>
@@ -2017,7 +2017,7 @@
                 <w:sz w:val="12"/>
                 <w:szCs w:val="12"/>
               </w:rPr>
-              <w:t xml:space="preserve">624</w:t>
+              <w:t xml:space="preserve">634</w:t>
             </w:r>
           </w:p>
         </w:tc>
@@ -2053,7 +2053,7 @@
                 <w:sz w:val="12"/>
                 <w:szCs w:val="12"/>
               </w:rPr>
-              <w:t xml:space="preserve">627</w:t>
+              <w:t xml:space="preserve">637</w:t>
             </w:r>
           </w:p>
         </w:tc>
@@ -2089,7 +2089,7 @@
                 <w:sz w:val="12"/>
                 <w:szCs w:val="12"/>
               </w:rPr>
-              <w:t xml:space="preserve">649</w:t>
+              <w:t xml:space="preserve">660</w:t>
             </w:r>
           </w:p>
         </w:tc>
@@ -2382,115 +2382,115 @@
                 <w:sz w:val="12"/>
                 <w:szCs w:val="12"/>
               </w:rPr>
-              <w:t xml:space="preserve">434</w:t>
-            </w:r>
-          </w:p>
-        </w:tc>
-        <w:tc>
-          <w:tcPr>
-            <w:tcW w:type="dxa" w:w="840"/>
-            <w:tcBorders>
-              <w:top w:val="none" w:color="FFFFFF" w:sz="0"/>
-              <w:left w:val="none" w:color="FFFFFF" w:sz="0"/>
-              <w:bottom w:val="single" w:color="D5D9E0" w:sz="4"/>
-              <w:right w:val="none" w:color="FFFFFF" w:sz="0"/>
-            </w:tcBorders>
-            <w:shd w:fill="F7F8FB" w:color="auto" w:val="clear"/>
-            <w:tcMar>
-              <w:top w:type="dxa" w:w="18"/>
-              <w:left w:type="dxa" w:w="60"/>
-              <w:bottom w:type="dxa" w:w="18"/>
-              <w:right w:type="dxa" w:w="60"/>
-            </w:tcMar>
-            <w:vAlign w:val="center"/>
-          </w:tcPr>
-          <w:p>
-            <w:pPr>
-              <w:spacing w:line="204" w:lineRule="auto"/>
-              <w:jc w:val="right"/>
-            </w:pPr>
-            <w:r>
-              <w:rPr>
-                <w:rFonts w:ascii="Arial" w:cs="Arial" w:eastAsia="Arial" w:hAnsi="Arial"/>
-                <w:b w:val="false"/>
-                <w:bCs w:val="false"/>
-                <w:color w:val="1A1A1A"/>
-                <w:sz w:val="12"/>
-                <w:szCs w:val="12"/>
-              </w:rPr>
-              <w:t xml:space="preserve">437</w:t>
-            </w:r>
-          </w:p>
-        </w:tc>
-        <w:tc>
-          <w:tcPr>
-            <w:tcW w:type="dxa" w:w="840"/>
-            <w:tcBorders>
-              <w:top w:val="none" w:color="FFFFFF" w:sz="0"/>
-              <w:left w:val="none" w:color="FFFFFF" w:sz="0"/>
-              <w:bottom w:val="single" w:color="D5D9E0" w:sz="4"/>
-              <w:right w:val="none" w:color="FFFFFF" w:sz="0"/>
-            </w:tcBorders>
-            <w:shd w:fill="F7F8FB" w:color="auto" w:val="clear"/>
-            <w:tcMar>
-              <w:top w:type="dxa" w:w="18"/>
-              <w:left w:type="dxa" w:w="60"/>
-              <w:bottom w:type="dxa" w:w="18"/>
-              <w:right w:type="dxa" w:w="60"/>
-            </w:tcMar>
-            <w:vAlign w:val="center"/>
-          </w:tcPr>
-          <w:p>
-            <w:pPr>
-              <w:spacing w:line="204" w:lineRule="auto"/>
-              <w:jc w:val="right"/>
-            </w:pPr>
-            <w:r>
-              <w:rPr>
-                <w:rFonts w:ascii="Arial" w:cs="Arial" w:eastAsia="Arial" w:hAnsi="Arial"/>
-                <w:b w:val="false"/>
-                <w:bCs w:val="false"/>
-                <w:color w:val="1A1A1A"/>
-                <w:sz w:val="12"/>
-                <w:szCs w:val="12"/>
-              </w:rPr>
-              <w:t xml:space="preserve">432</w:t>
-            </w:r>
-          </w:p>
-        </w:tc>
-        <w:tc>
-          <w:tcPr>
-            <w:tcW w:type="dxa" w:w="840"/>
-            <w:tcBorders>
-              <w:top w:val="none" w:color="FFFFFF" w:sz="0"/>
-              <w:left w:val="none" w:color="FFFFFF" w:sz="0"/>
-              <w:bottom w:val="single" w:color="D5D9E0" w:sz="4"/>
-              <w:right w:val="none" w:color="FFFFFF" w:sz="0"/>
-            </w:tcBorders>
-            <w:shd w:fill="F7F8FB" w:color="auto" w:val="clear"/>
-            <w:tcMar>
-              <w:top w:type="dxa" w:w="18"/>
-              <w:left w:type="dxa" w:w="60"/>
-              <w:bottom w:type="dxa" w:w="18"/>
-              <w:right w:type="dxa" w:w="60"/>
-            </w:tcMar>
-            <w:vAlign w:val="center"/>
-          </w:tcPr>
-          <w:p>
-            <w:pPr>
-              <w:spacing w:line="204" w:lineRule="auto"/>
-              <w:jc w:val="right"/>
-            </w:pPr>
-            <w:r>
-              <w:rPr>
-                <w:rFonts w:ascii="Arial" w:cs="Arial" w:eastAsia="Arial" w:hAnsi="Arial"/>
-                <w:b w:val="false"/>
-                <w:bCs w:val="false"/>
-                <w:color w:val="1A1A1A"/>
-                <w:sz w:val="12"/>
-                <w:szCs w:val="12"/>
-              </w:rPr>
-              <w:t xml:space="preserve">445</w:t>
+              <w:t xml:space="preserve">438</w:t>
+            </w:r>
+          </w:p>
+        </w:tc>
+        <w:tc>
+          <w:tcPr>
+            <w:tcW w:type="dxa" w:w="840"/>
+            <w:tcBorders>
+              <w:top w:val="none" w:color="FFFFFF" w:sz="0"/>
+              <w:left w:val="none" w:color="FFFFFF" w:sz="0"/>
+              <w:bottom w:val="single" w:color="D5D9E0" w:sz="4"/>
+              <w:right w:val="none" w:color="FFFFFF" w:sz="0"/>
+            </w:tcBorders>
+            <w:shd w:fill="F7F8FB" w:color="auto" w:val="clear"/>
+            <w:tcMar>
+              <w:top w:type="dxa" w:w="18"/>
+              <w:left w:type="dxa" w:w="60"/>
+              <w:bottom w:type="dxa" w:w="18"/>
+              <w:right w:type="dxa" w:w="60"/>
+            </w:tcMar>
+            <w:vAlign w:val="center"/>
+          </w:tcPr>
+          <w:p>
+            <w:pPr>
+              <w:spacing w:line="204" w:lineRule="auto"/>
+              <w:jc w:val="right"/>
+            </w:pPr>
+            <w:r>
+              <w:rPr>
+                <w:rFonts w:ascii="Arial" w:cs="Arial" w:eastAsia="Arial" w:hAnsi="Arial"/>
+                <w:b w:val="false"/>
+                <w:bCs w:val="false"/>
+                <w:color w:val="1A1A1A"/>
+                <w:sz w:val="12"/>
+                <w:szCs w:val="12"/>
+              </w:rPr>
+              <w:t xml:space="preserve">446</w:t>
+            </w:r>
+          </w:p>
+        </w:tc>
+        <w:tc>
+          <w:tcPr>
+            <w:tcW w:type="dxa" w:w="840"/>
+            <w:tcBorders>
+              <w:top w:val="none" w:color="FFFFFF" w:sz="0"/>
+              <w:left w:val="none" w:color="FFFFFF" w:sz="0"/>
+              <w:bottom w:val="single" w:color="D5D9E0" w:sz="4"/>
+              <w:right w:val="none" w:color="FFFFFF" w:sz="0"/>
+            </w:tcBorders>
+            <w:shd w:fill="F7F8FB" w:color="auto" w:val="clear"/>
+            <w:tcMar>
+              <w:top w:type="dxa" w:w="18"/>
+              <w:left w:type="dxa" w:w="60"/>
+              <w:bottom w:type="dxa" w:w="18"/>
+              <w:right w:type="dxa" w:w="60"/>
+            </w:tcMar>
+            <w:vAlign w:val="center"/>
+          </w:tcPr>
+          <w:p>
+            <w:pPr>
+              <w:spacing w:line="204" w:lineRule="auto"/>
+              <w:jc w:val="right"/>
+            </w:pPr>
+            <w:r>
+              <w:rPr>
+                <w:rFonts w:ascii="Arial" w:cs="Arial" w:eastAsia="Arial" w:hAnsi="Arial"/>
+                <w:b w:val="false"/>
+                <w:bCs w:val="false"/>
+                <w:color w:val="1A1A1A"/>
+                <w:sz w:val="12"/>
+                <w:szCs w:val="12"/>
+              </w:rPr>
+              <w:t xml:space="preserve">441</w:t>
+            </w:r>
+          </w:p>
+        </w:tc>
+        <w:tc>
+          <w:tcPr>
+            <w:tcW w:type="dxa" w:w="840"/>
+            <w:tcBorders>
+              <w:top w:val="none" w:color="FFFFFF" w:sz="0"/>
+              <w:left w:val="none" w:color="FFFFFF" w:sz="0"/>
+              <w:bottom w:val="single" w:color="D5D9E0" w:sz="4"/>
+              <w:right w:val="none" w:color="FFFFFF" w:sz="0"/>
+            </w:tcBorders>
+            <w:shd w:fill="F7F8FB" w:color="auto" w:val="clear"/>
+            <w:tcMar>
+              <w:top w:type="dxa" w:w="18"/>
+              <w:left w:type="dxa" w:w="60"/>
+              <w:bottom w:type="dxa" w:w="18"/>
+              <w:right w:type="dxa" w:w="60"/>
+            </w:tcMar>
+            <w:vAlign w:val="center"/>
+          </w:tcPr>
+          <w:p>
+            <w:pPr>
+              <w:spacing w:line="204" w:lineRule="auto"/>
+              <w:jc w:val="right"/>
+            </w:pPr>
+            <w:r>
+              <w:rPr>
+                <w:rFonts w:ascii="Arial" w:cs="Arial" w:eastAsia="Arial" w:hAnsi="Arial"/>
+                <w:b w:val="false"/>
+                <w:bCs w:val="false"/>
+                <w:color w:val="1A1A1A"/>
+                <w:sz w:val="12"/>
+                <w:szCs w:val="12"/>
+              </w:rPr>
+              <w:t xml:space="preserve">454</w:t>
             </w:r>
           </w:p>
         </w:tc>
@@ -2783,7 +2783,7 @@
                 <w:sz w:val="12"/>
                 <w:szCs w:val="12"/>
               </w:rPr>
-              <w:t xml:space="preserve">52.9</w:t>
+              <w:t xml:space="preserve">53.0</w:t>
             </w:r>
           </w:p>
         </w:tc>
@@ -2819,7 +2819,7 @@
                 <w:sz w:val="12"/>
                 <w:szCs w:val="12"/>
               </w:rPr>
-              <w:t xml:space="preserve">50.2</w:t>
+              <w:t xml:space="preserve">50.3</w:t>
             </w:r>
           </w:p>
         </w:tc>
@@ -2855,7 +2855,7 @@
                 <w:sz w:val="12"/>
                 <w:szCs w:val="12"/>
               </w:rPr>
-              <w:t xml:space="preserve">47.1</w:t>
+              <w:t xml:space="preserve">47.2</w:t>
             </w:r>
           </w:p>
         </w:tc>
@@ -2891,7 +2891,7 @@
                 <w:sz w:val="12"/>
                 <w:szCs w:val="12"/>
               </w:rPr>
-              <w:t xml:space="preserve">46.2</w:t>
+              <w:t xml:space="preserve">46.3</w:t>
             </w:r>
           </w:p>
         </w:tc>
@@ -3148,6 +3148,42 @@
                 <w:sz w:val="12"/>
                 <w:szCs w:val="12"/>
               </w:rPr>
+              <w:t xml:space="preserve">.090</w:t>
+            </w:r>
+          </w:p>
+        </w:tc>
+        <w:tc>
+          <w:tcPr>
+            <w:tcW w:type="dxa" w:w="840"/>
+            <w:tcBorders>
+              <w:top w:val="none" w:color="FFFFFF" w:sz="0"/>
+              <w:left w:val="none" w:color="FFFFFF" w:sz="0"/>
+              <w:bottom w:val="single" w:color="D5D9E0" w:sz="4"/>
+              <w:right w:val="none" w:color="FFFFFF" w:sz="0"/>
+            </w:tcBorders>
+            <w:shd w:fill="F7F8FB" w:color="auto" w:val="clear"/>
+            <w:tcMar>
+              <w:top w:type="dxa" w:w="18"/>
+              <w:left w:type="dxa" w:w="60"/>
+              <w:bottom w:type="dxa" w:w="18"/>
+              <w:right w:type="dxa" w:w="60"/>
+            </w:tcMar>
+            <w:vAlign w:val="center"/>
+          </w:tcPr>
+          <w:p>
+            <w:pPr>
+              <w:spacing w:line="204" w:lineRule="auto"/>
+              <w:jc w:val="right"/>
+            </w:pPr>
+            <w:r>
+              <w:rPr>
+                <w:rFonts w:ascii="Arial" w:cs="Arial" w:eastAsia="Arial" w:hAnsi="Arial"/>
+                <w:b w:val="false"/>
+                <w:bCs w:val="false"/>
+                <w:color w:val="1A1A1A"/>
+                <w:sz w:val="12"/>
+                <w:szCs w:val="12"/>
+              </w:rPr>
               <w:t xml:space="preserve">.091</w:t>
             </w:r>
           </w:p>
@@ -3184,42 +3220,6 @@
                 <w:sz w:val="12"/>
                 <w:szCs w:val="12"/>
               </w:rPr>
-              <w:t xml:space="preserve">.092</w:t>
-            </w:r>
-          </w:p>
-        </w:tc>
-        <w:tc>
-          <w:tcPr>
-            <w:tcW w:type="dxa" w:w="840"/>
-            <w:tcBorders>
-              <w:top w:val="none" w:color="FFFFFF" w:sz="0"/>
-              <w:left w:val="none" w:color="FFFFFF" w:sz="0"/>
-              <w:bottom w:val="single" w:color="D5D9E0" w:sz="4"/>
-              <w:right w:val="none" w:color="FFFFFF" w:sz="0"/>
-            </w:tcBorders>
-            <w:shd w:fill="F7F8FB" w:color="auto" w:val="clear"/>
-            <w:tcMar>
-              <w:top w:type="dxa" w:w="18"/>
-              <w:left w:type="dxa" w:w="60"/>
-              <w:bottom w:type="dxa" w:w="18"/>
-              <w:right w:type="dxa" w:w="60"/>
-            </w:tcMar>
-            <w:vAlign w:val="center"/>
-          </w:tcPr>
-          <w:p>
-            <w:pPr>
-              <w:spacing w:line="204" w:lineRule="auto"/>
-              <w:jc w:val="right"/>
-            </w:pPr>
-            <w:r>
-              <w:rPr>
-                <w:rFonts w:ascii="Arial" w:cs="Arial" w:eastAsia="Arial" w:hAnsi="Arial"/>
-                <w:b w:val="false"/>
-                <w:bCs w:val="false"/>
-                <w:color w:val="1A1A1A"/>
-                <w:sz w:val="12"/>
-                <w:szCs w:val="12"/>
-              </w:rPr>
               <w:t xml:space="preserve">.093</w:t>
             </w:r>
           </w:p>
@@ -3256,43 +3256,43 @@
                 <w:sz w:val="12"/>
                 <w:szCs w:val="12"/>
               </w:rPr>
-              <w:t xml:space="preserve">.093</w:t>
-            </w:r>
-          </w:p>
-        </w:tc>
-        <w:tc>
-          <w:tcPr>
-            <w:tcW w:type="dxa" w:w="840"/>
-            <w:tcBorders>
-              <w:top w:val="none" w:color="FFFFFF" w:sz="0"/>
-              <w:left w:val="none" w:color="FFFFFF" w:sz="0"/>
-              <w:bottom w:val="single" w:color="D5D9E0" w:sz="4"/>
-              <w:right w:val="none" w:color="FFFFFF" w:sz="0"/>
-            </w:tcBorders>
-            <w:shd w:fill="F7F8FB" w:color="auto" w:val="clear"/>
-            <w:tcMar>
-              <w:top w:type="dxa" w:w="18"/>
-              <w:left w:type="dxa" w:w="60"/>
-              <w:bottom w:type="dxa" w:w="18"/>
-              <w:right w:type="dxa" w:w="60"/>
-            </w:tcMar>
-            <w:vAlign w:val="center"/>
-          </w:tcPr>
-          <w:p>
-            <w:pPr>
-              <w:spacing w:line="204" w:lineRule="auto"/>
-              <w:jc w:val="right"/>
-            </w:pPr>
-            <w:r>
-              <w:rPr>
-                <w:rFonts w:ascii="Arial" w:cs="Arial" w:eastAsia="Arial" w:hAnsi="Arial"/>
-                <w:b w:val="false"/>
-                <w:bCs w:val="false"/>
-                <w:color w:val="1A1A1A"/>
-                <w:sz w:val="12"/>
-                <w:szCs w:val="12"/>
-              </w:rPr>
               <w:t xml:space="preserve">.094</w:t>
+            </w:r>
+          </w:p>
+        </w:tc>
+        <w:tc>
+          <w:tcPr>
+            <w:tcW w:type="dxa" w:w="840"/>
+            <w:tcBorders>
+              <w:top w:val="none" w:color="FFFFFF" w:sz="0"/>
+              <w:left w:val="none" w:color="FFFFFF" w:sz="0"/>
+              <w:bottom w:val="single" w:color="D5D9E0" w:sz="4"/>
+              <w:right w:val="none" w:color="FFFFFF" w:sz="0"/>
+            </w:tcBorders>
+            <w:shd w:fill="F7F8FB" w:color="auto" w:val="clear"/>
+            <w:tcMar>
+              <w:top w:type="dxa" w:w="18"/>
+              <w:left w:type="dxa" w:w="60"/>
+              <w:bottom w:type="dxa" w:w="18"/>
+              <w:right w:type="dxa" w:w="60"/>
+            </w:tcMar>
+            <w:vAlign w:val="center"/>
+          </w:tcPr>
+          <w:p>
+            <w:pPr>
+              <w:spacing w:line="204" w:lineRule="auto"/>
+              <w:jc w:val="right"/>
+            </w:pPr>
+            <w:r>
+              <w:rPr>
+                <w:rFonts w:ascii="Arial" w:cs="Arial" w:eastAsia="Arial" w:hAnsi="Arial"/>
+                <w:b w:val="false"/>
+                <w:bCs w:val="false"/>
+                <w:color w:val="1A1A1A"/>
+                <w:sz w:val="12"/>
+                <w:szCs w:val="12"/>
+              </w:rPr>
+              <w:t xml:space="preserve">.095</w:t>
             </w:r>
           </w:p>
         </w:tc>
@@ -3549,7 +3549,7 @@
                 <w:sz w:val="12"/>
                 <w:szCs w:val="12"/>
               </w:rPr>
-              <w:t xml:space="preserve">1.71</w:t>
+              <w:t xml:space="preserve">1.70</w:t>
             </w:r>
           </w:p>
         </w:tc>
@@ -3585,7 +3585,7 @@
                 <w:sz w:val="12"/>
                 <w:szCs w:val="12"/>
               </w:rPr>
-              <w:t xml:space="preserve">1.74</w:t>
+              <w:t xml:space="preserve">1.73</w:t>
             </w:r>
           </w:p>
         </w:tc>
@@ -3621,7 +3621,7 @@
                 <w:sz w:val="12"/>
                 <w:szCs w:val="12"/>
               </w:rPr>
-              <w:t xml:space="preserve">1.79</w:t>
+              <w:t xml:space="preserve">1.78</w:t>
             </w:r>
           </w:p>
         </w:tc>
@@ -3950,43 +3950,43 @@
                 <w:sz w:val="12"/>
                 <w:szCs w:val="12"/>
               </w:rPr>
-              <w:t xml:space="preserve">12.0</w:t>
-            </w:r>
-          </w:p>
-        </w:tc>
-        <w:tc>
-          <w:tcPr>
-            <w:tcW w:type="dxa" w:w="840"/>
-            <w:tcBorders>
-              <w:top w:val="none" w:color="FFFFFF" w:sz="0"/>
-              <w:left w:val="none" w:color="FFFFFF" w:sz="0"/>
-              <w:bottom w:val="single" w:color="D5D9E0" w:sz="4"/>
-              <w:right w:val="none" w:color="FFFFFF" w:sz="0"/>
-            </w:tcBorders>
-            <w:shd w:fill="F7F8FB" w:color="auto" w:val="clear"/>
-            <w:tcMar>
-              <w:top w:type="dxa" w:w="18"/>
-              <w:left w:type="dxa" w:w="60"/>
-              <w:bottom w:type="dxa" w:w="18"/>
-              <w:right w:type="dxa" w:w="60"/>
-            </w:tcMar>
-            <w:vAlign w:val="center"/>
-          </w:tcPr>
-          <w:p>
-            <w:pPr>
-              <w:spacing w:line="204" w:lineRule="auto"/>
-              <w:jc w:val="right"/>
-            </w:pPr>
-            <w:r>
-              <w:rPr>
-                <w:rFonts w:ascii="Arial" w:cs="Arial" w:eastAsia="Arial" w:hAnsi="Arial"/>
-                <w:b w:val="false"/>
-                <w:bCs w:val="false"/>
-                <w:color w:val="1A1A1A"/>
-                <w:sz w:val="12"/>
-                <w:szCs w:val="12"/>
-              </w:rPr>
-              <w:t xml:space="preserve">11.9</w:t>
+              <w:t xml:space="preserve">11.8</w:t>
+            </w:r>
+          </w:p>
+        </w:tc>
+        <w:tc>
+          <w:tcPr>
+            <w:tcW w:type="dxa" w:w="840"/>
+            <w:tcBorders>
+              <w:top w:val="none" w:color="FFFFFF" w:sz="0"/>
+              <w:left w:val="none" w:color="FFFFFF" w:sz="0"/>
+              <w:bottom w:val="single" w:color="D5D9E0" w:sz="4"/>
+              <w:right w:val="none" w:color="FFFFFF" w:sz="0"/>
+            </w:tcBorders>
+            <w:shd w:fill="F7F8FB" w:color="auto" w:val="clear"/>
+            <w:tcMar>
+              <w:top w:type="dxa" w:w="18"/>
+              <w:left w:type="dxa" w:w="60"/>
+              <w:bottom w:type="dxa" w:w="18"/>
+              <w:right w:type="dxa" w:w="60"/>
+            </w:tcMar>
+            <w:vAlign w:val="center"/>
+          </w:tcPr>
+          <w:p>
+            <w:pPr>
+              <w:spacing w:line="204" w:lineRule="auto"/>
+              <w:jc w:val="right"/>
+            </w:pPr>
+            <w:r>
+              <w:rPr>
+                <w:rFonts w:ascii="Arial" w:cs="Arial" w:eastAsia="Arial" w:hAnsi="Arial"/>
+                <w:b w:val="false"/>
+                <w:bCs w:val="false"/>
+                <w:color w:val="1A1A1A"/>
+                <w:sz w:val="12"/>
+                <w:szCs w:val="12"/>
+              </w:rPr>
+              <w:t xml:space="preserve">11.7</w:t>
             </w:r>
           </w:p>
         </w:tc>
@@ -4351,7 +4351,7 @@
                 <w:sz w:val="12"/>
                 <w:szCs w:val="12"/>
               </w:rPr>
-              <w:t xml:space="preserve">8.6</w:t>
+              <w:t xml:space="preserve">8.5</w:t>
             </w:r>
           </w:p>
         </w:tc>
@@ -4495,7 +4495,7 @@
                 <w:sz w:val="12"/>
                 <w:szCs w:val="12"/>
               </w:rPr>
-              <w:t xml:space="preserve">8.2</w:t>
+              <w:t xml:space="preserve">8.3</w:t>
             </w:r>
           </w:p>
         </w:tc>
@@ -4752,7 +4752,7 @@
                 <w:sz w:val="12"/>
                 <w:szCs w:val="12"/>
               </w:rPr>
-              <w:t xml:space="preserve">5.1</w:t>
+              <w:t xml:space="preserve">5.0</w:t>
             </w:r>
           </w:p>
         </w:tc>
@@ -4824,7 +4824,7 @@
                 <w:sz w:val="12"/>
                 <w:szCs w:val="12"/>
               </w:rPr>
-              <w:t xml:space="preserve">4.6</w:t>
+              <w:t xml:space="preserve">4.7</w:t>
             </w:r>
           </w:p>
         </w:tc>
@@ -4896,7 +4896,7 @@
                 <w:sz w:val="12"/>
                 <w:szCs w:val="12"/>
               </w:rPr>
-              <w:t xml:space="preserve">4.3</w:t>
+              <w:t xml:space="preserve">4.4</w:t>
             </w:r>
           </w:p>
         </w:tc>
@@ -4992,7 +4992,7 @@
                 <w:sz w:val="16"/>
                 <w:szCs w:val="16"/>
               </w:rPr>
-              <w:t xml:space="preserve">Under IAS 40, revaluations of investment property run through the income statement. In 2025 a CLP 1,447bn fair-value gain, 27% of opening property value against about 2% a year at Parque Arauco and Cencosud Shopping, lifted attributable net income to CLP 1,431bn (2.2x revenue) and reported ROE to 37.5% (Figure 1). About two-thirds of Chile's 29% uplift came from a lower appraisal discount rate, not from higher NOI.</w:t>
+              <w:t xml:space="preserve">Under IAS 40, revaluations of investment property run through the income statement. In 2025 a CLP 1,447bn fair-value gain, 27% of opening property value against about 2% a year at Parque Arauco and Cencosud Shopping, lifted attributable net income to CLP 1,431bn (2.2x revenue) and reported ROE to 37.5% (Figure 1). About two-thirds of Chile's 29% uplift came from a lower appraisal discount rate (6.62% to 5.64% real, Note 11), not from higher NOI (Appendix 3C).</w:t>
             </w:r>
           </w:p>
           <w:p>
@@ -5007,7 +5007,7 @@
                 <w:sz w:val="16"/>
                 <w:szCs w:val="16"/>
               </w:rPr>
-              <w:t xml:space="preserve">Excluding fair-value gains net of deferred tax, audited distributable profit was CLP 369bn and ROE 9.7%, the highest of the three local peers on a comparable basis (Appendix 6). FFO, which we rebuild from the statements to within 0.02% of the reported CLP 405bn (Figure 2), held a 59–62% margin over 2022–2025 while net income swung more than fourfold. FFO excludes the UF indexation of debt (CLP 44bn, 11% of FFO); distributable profit includes it and is our conservative earnings anchor.</w:t>
+              <w:t xml:space="preserve">Excluding fair-value gains net of deferred tax, audited distributable profit was CLP 369bn and ROE 9.7%; with the same adjustment we apply to peers it would be 10.0%, the highest of the three (Appendix 6). FFO, which we rebuild from the statements to within 0.02% of the reported CLP 405bn (Figure 2), held a 59–62% margin over 2022–2025 while net income swung more than fourfold. FFO excludes the UF indexation of debt (CLP 44bn, 11% of FFO); distributable profit includes it and is our conservative earnings anchor.</w:t>
             </w:r>
           </w:p>
           <w:p>
@@ -5022,7 +5022,7 @@
                 <w:sz w:val="16"/>
                 <w:szCs w:val="16"/>
               </w:rPr>
-              <w:t xml:space="preserve">Broken down, 2025 normalized ROE (9.7%) is a 56.5% normalized net margin times an asset turnover of only 0.097x and 1.77x accounting leverage. Turnover is low because the balance sheet is at fair value: each revaluation inflates assets and equity without bringing in more cash. We therefore forecast normalized ROE stable at around 8%, rising only with leverage, not with operations.</w:t>
+              <w:t xml:space="preserve">Broken down, 2025 normalized ROE (9.7%) is a 56.5% normalized net margin times an asset turnover of 0.097x and 1.77x accounting leverage. It is not the shareholder's return: the denominator is equity at appraised value, and each revaluation raises its book value without generating cash flow, because it is a non-cash fair-value change that does not enter FFO or dividends. We therefore forecast normalized ROE of 8–9%, rising only with leverage.</w:t>
             </w:r>
           </w:p>
           <w:p>
@@ -5057,7 +5057,7 @@
                 <w:sz w:val="16"/>
                 <w:szCs w:val="16"/>
               </w:rPr>
-              <w:t xml:space="preserve">Revenue rose 76% between 2022 and 2025, but 21.8pp of 2025's 32.2% came from perimeter: the Peruvian portfolio bought from Falabella, consolidated from 4 December 2024. Ex-Peru, revenue grew 10.7% in 2025 and 7.1% in 1H26.</w:t>
+              <w:t xml:space="preserve">Revenue rose 76% between 2022 and 2025, but 21.8pp of 2025's 32.2% came from perimeter: the Peruvian portfolio bought from Falabella, consolidated from 4 December 2024 (Appendix 3C). Ex-Peru, revenue grew 10.7% in 2025 and 7.1% in 1H26.</w:t>
             </w:r>
           </w:p>
           <w:p>
@@ -5072,7 +5072,7 @@
                 <w:sz w:val="16"/>
                 <w:szCs w:val="16"/>
               </w:rPr>
-              <w:t xml:space="preserve">Once currency and inflation are removed, 1H26 reported growth of 7.4% falls to about 3.0% real (Figure 3). Chile grew 2.8% after 3.1% UF indexation (5.1% in 2025); Peru 4.5% despite occupancy slipping to 93.8%; Colombia only about 1% once a 7.5% COP appreciation and 6.1% inflation are stripped out. In other words, roughly 60% of 1H26 reported growth came from prices and currency, not from more activity.</w:t>
+              <w:t xml:space="preserve">Once currency and inflation are removed, the 7.4% growth of 1H26 falls to ~3.0% real (Figure 3): Chile 2.8% (UF +3.1%), Peru 4.5% (occupancy 93.8%) and Colombia ~1% net of the 7.5% COP appreciation and 6.1% inflation.</w:t>
             </w:r>
           </w:p>
           <w:p>
@@ -5087,7 +5087,7 @@
                 <w:sz w:val="16"/>
                 <w:szCs w:val="16"/>
               </w:rPr>
-              <w:t xml:space="preserve">Growth is contractual, not sales-driven. Variable rent is 5.1% of revenue and fell 1.1% in 1H26 while tenant sales rose 6.7%, because minimum rents (same-store rent +5.5%) are outpacing tenant sales (same-store sales +3.7%). Revenue is therefore bond-like, but its real growth is converging on the 0.4–0.9% the company assumes for Chile in its own appraisal.</w:t>
+              <w:t xml:space="preserve">In our reading, growth depends more on contracts than on sales: variable rent is 5.1% of 1H26 revenue and fell 1.1% while tenant sales rose 6.7%, because minimum rents (+5.5%) are outpacing sales (+3.7%). It is not a bond: 15.1% of GLA expires within two years and tenant solvency matters, and real growth converges on the 0.4–0.9% of the appraisal.</w:t>
             </w:r>
           </w:p>
           <w:p>
@@ -5107,7 +5107,7 @@
                 <w:sz w:val="16"/>
                 <w:szCs w:val="16"/>
               </w:rPr>
-              <w:t xml:space="preserve">Margin gains came from mix and cost recovery; operating leverage is spent</w:t>
+              <w:t xml:space="preserve">Margin gains came from mix and cost recovery; further room looks limited</w:t>
             </w:r>
           </w:p>
           <w:p>
@@ -5122,7 +5122,7 @@
                 <w:sz w:val="16"/>
                 <w:szCs w:val="16"/>
               </w:rPr>
-              <w:t xml:space="preserve">EBITDA margin rose from 76.2% in 2022 to 80.5% in 2025 for two reasons. Peru consolidates at an 83% segment margin, against 80% in Chile and 73% in Colombia. Chile's margin gained 2.4pp on a higher recovery of common charges, which are presented net of cost (Note 2.20): real, but dependent on occupancy and tenant negotiations, so not structural.</w:t>
+              <w:t xml:space="preserve">EBITDA margin rose from 76.2% in 2022 to 80.5% in 2025 for two reasons. Peru consolidates at an 83% segment margin, against 80% in Chile and 73% in Colombia. And Chile's margin gained 2.4pp on a higher recovery of common charges, presented net of cost (Note 2.20): real, but dependent on occupancy and tenant negotiations, so we do not extrapolate it.</w:t>
             </w:r>
           </w:p>
           <w:p>
@@ -5137,22 +5137,7 @@
                 <w:sz w:val="16"/>
                 <w:szCs w:val="16"/>
               </w:rPr>
-              <w:t xml:space="preserve">With cost of sales at 6% of revenue and total operating costs near 20%, little fixed cost is left to dilute; with D&amp;A at 0.7% of revenue, EBIT (CLP 523bn in 2025) tracks EBITDA. In 1H26 EBITDA grew 7.4%, in line with revenue, and margin held at 79.7%. Administrative expense rose 18.1% on payroll (+18.9%: CEO transition and a full year of Peru), a bad-debt charge rebounding from a 2025 base flattered by recoveries (0.64% of revenue, below 1.22% in 2024), and a one-off Colombian wealth tax of CLP 1.7bn. Excluding the last two, 1H26 margin would be 80.4%, up 0.7pp.</w:t>
-            </w:r>
-          </w:p>
-          <w:p>
-            <w:pPr>
-              <w:spacing w:after="60" w:before="0" w:line="228" w:lineRule="auto"/>
-              <w:jc w:val="both"/>
-            </w:pPr>
-            <w:r>
-              <w:rPr>
-                <w:rFonts w:ascii="Arial" w:cs="Arial" w:eastAsia="Arial" w:hAnsi="Arial"/>
-                <w:color w:val="1A1A1A"/>
-                <w:sz w:val="16"/>
-                <w:szCs w:val="16"/>
-              </w:rPr>
-              <w:t xml:space="preserve">Operating costs have already fallen from 23.8% of revenue in 2023 to 20.1% in 2025 (Appendix 3), so there is little left for the margin to gain: from here, EBITDA grows with rents, not with efficiency.</w:t>
+              <w:t xml:space="preserve">Operating costs (cost of sales plus administration) were 20.1% of revenue in 2025 and include D&amp;A (0.55%): 20.1% − 0.55% = 19.5% = 1 − EBITDA margin (Appendix 3). If they were fixed, a 1% fall in revenue would cut EBITDA by 1.24% (1.1% if half were variable). In 1H26 EBITDA grew 7.4%, in line with revenue, and margin held at 79.7%. Administrative expense rose 18.1% on payroll (+18.9%: CEO transition and a full year of Peru), bad debts normalizing from a 2025 base flattered by recoveries, and a one-off Colombian wealth tax of CLP 1.7bn. Excluding the last two, 1H26 margin would be 80.4%.</w:t>
             </w:r>
           </w:p>
         </w:tc>
@@ -5511,7 +5496,7 @@
                 <w:sz w:val="16"/>
                 <w:szCs w:val="16"/>
               </w:rPr>
-              <w:t xml:space="preserve">Cash covers the dividend 2.6x; the ceiling is policy, not liquidity</w:t>
+              <w:t xml:space="preserve">Cash covers the dividend 2.6x before debt and 1.8x after repaying it</w:t>
             </w:r>
           </w:p>
           <w:p>
@@ -5526,7 +5511,7 @@
                 <w:sz w:val="16"/>
                 <w:szCs w:val="16"/>
               </w:rPr>
-              <w:t xml:space="preserve">Operating cash flow rose from CLP 301bn in 2024 to CLP 441bn in 2025, converting 98.7% of EBITDA before tax. Cash tax was only 15% of operating profit, sheltered by tax goodwill from Chilean reorganizations and loss carry-forwards (Note 13), and will rise toward the 27% statutory rate. After capex and net interest, free cash flow before debt service was CLP 280bn, covering dividends 2.6x (Figure 4).</w:t>
+              <w:t xml:space="preserve">Operating cash flow rose from CLP 301bn in 2024 to CLP 441bn in 2025. Cash tax was only 15% of operating profit, sheltered by tax goodwill and loss carry-forwards (Note 13), and will rise toward the 27% statutory rate. After capex and net interest, free cash flow before debt was CLP 280bn, covering dividends 2.6x (Figure 4); 1.8x after repaying net debt (Appendix 2D).</w:t>
             </w:r>
           </w:p>
           <w:p>
@@ -5541,7 +5526,7 @@
                 <w:sz w:val="16"/>
                 <w:szCs w:val="16"/>
               </w:rPr>
-              <w:t xml:space="preserve">The 38.6% jump in 1H26 operating cash flow is not earnings power: 59% of it was December collections unwinding through working capital. Receivable days fell from 66 to 50, with no sign of weaker collection.</w:t>
+              <w:t xml:space="preserve">The CLP 71.9bn (+38.6%) rise in 1H26 operating cash flow comes 78% from higher collections (partly December balances: receivable days from 66 to 50) and 15% from lower taxes paid; we do not extrapolate it.</w:t>
             </w:r>
           </w:p>
           <w:p>
@@ -5556,7 +5541,7 @@
                 <w:sz w:val="16"/>
                 <w:szCs w:val="16"/>
               </w:rPr>
-              <w:t xml:space="preserve">The dividend policy pays out 40% of distributable profit with a one-year lag, so retained cash is high: CLP 171.6bn in 2025. In the base case, FFO rises from CLP 428.5bn in 2026E to CLP 501.6bn in 2031E and ordinary dividends from CLP 147.7bn to 172.6bn; the remaining cash, together with new debt, funds capex and the additional distributions (Appendix 5).</w:t>
+              <w:t xml:space="preserve">The dividend policy pays out 40% of distributable profit with a one-year lag and the covenant (net debt/equity ≤ 2.0x; 0.26x at June) does not constrain it: retained cash was CLP 171.6bn in 2025. In the base case, FFO rises from CLP 428.5bn in 2026E to 512.6bn in 2031E and ordinary dividends from CLP 147.7bn to 176.5bn; the remaining cash, together with new debt, funds capex and the additional distributions (Appendix 5).</w:t>
             </w:r>
           </w:p>
           <w:p>
@@ -5571,7 +5556,7 @@
                 <w:sz w:val="16"/>
                 <w:szCs w:val="16"/>
               </w:rPr>
-              <w:t xml:space="preserve">Capex is stepping up. Contractual investment commitments rose to CLP 78bn at June 2026 from CLP 18bn in December 2025, and 1H26 property capex was CLP 81bn (+176%). The base case funds USD 445m of remaining pipeline over 2026–2028 and then keeps adding about 27,000 m² of GLA a year, the 2022–2025 organic pace, so capex settles near 16% of revenue rather than the 5.5% maintenance floor (Figure 7).</w:t>
+              <w:t xml:space="preserve">Capex is stepping up. Contractual investment commitments rose to CLP 78bn at June 2026 from CLP 18bn in December 2025, and 1H26 property capex was CLP 81bn (+176%). The base case funds the USD 579m of remaining dated pipeline over 2026–2028 (including USD 134m of other projects in Chile) and then keeps adding about 27,000 m² a year, the 2022–2025 organic pace: total capex settles near 16% of revenue, 5.5% maintenance and ~11% incremental (Figure 7).</w:t>
             </w:r>
           </w:p>
           <w:p>
@@ -5606,7 +5591,7 @@
                 <w:sz w:val="16"/>
                 <w:szCs w:val="16"/>
               </w:rPr>
-              <w:t xml:space="preserve">LTV fell from 26.9% to 18.8% in 2025, but 5.0pp of the 8.0pp drop came from revaluing the denominator; with property at 2024 value plus additions, LTV would have been 23.8% (Figure 5). Cash-flow metrics are the honest lens and support Feller Rate's upgrade to AAA (25 September 2026): net debt/EBITDA fell from 3.78x to 2.36x on June 2026 LTM EBITDA (the 2024 figure includes only one month of Peru), and EBITDA covers financial costs 8.4x.</w:t>
+              <w:t xml:space="preserve">LTV fell from 26.9% to 18.8% in 2025, but 5.0pp of the 8.0pp drop came from revaluing the denominator; with property at 2024 value plus additions, LTV would have been 23.8% (Figure 5). Cash-flow metrics support Feller Rate's upgrade to AAA (25 September 2026), but of the fall in net debt/EBITDA from 3.78x to 2.36x, 0.75x is perimeter (Peru consolidated one month in 2024; pro forma ≥ 3.0x), 0.39x EBITDA growth and only 0.28x lower debt (Appendix 3B). EBITDA covers financial costs 8.4x.</w:t>
             </w:r>
           </w:p>
           <w:p>
@@ -5621,7 +5606,7 @@
                 <w:sz w:val="16"/>
                 <w:szCs w:val="16"/>
               </w:rPr>
-              <w:t xml:space="preserve">Gross debt of CLP 1,633bn is 79% UF, 14% PEN and 7% COP, matching revenue currencies; 95% is long term, with a 6.6-year duration. The UF bonds carry a 3.36% real coupon (3.48% effective), but with UF indexation the all-in nominal cost was about 7% in 2025. Maturities cluster in 2029, 2031 and 2033 (Figure 6); refinancing series S (1.32% effective) at the latest issue's 4.33% would add about CLP 4.9bn a year. Liquidity is ample: at June 2026 the current ratio was 2.50x and cash covered current liabilities 1.71x.</w:t>
+              <w:t xml:space="preserve">Gross debt of CLP 1,633bn is 79% UF, 14% PEN and 7% COP, matching revenue currencies; 95% is long term, with a 6.6-year duration. The UF bonds carry a 3.36% real coupon (3.48% effective); with UF indexation the all-in nominal cost was about 7% in 2025. Maturities cluster in 2029, 2031 and 2033 (Figure 6); refinancing series S (1.32% effective) at the latest issue's 4.33% would add about CLP 4.9bn a year. At June 2026 the current ratio was 2.50x and cash covered current liabilities 1.71x.</w:t>
             </w:r>
           </w:p>
           <w:p>
@@ -5636,7 +5621,7 @@
                 <w:sz w:val="16"/>
                 <w:szCs w:val="16"/>
               </w:rPr>
-              <w:t xml:space="preserve">Our base case spends that headroom. Net debt/EBITDA converges linearly from 2.36x to 3.5x by end-2031E, between Cencosud Shopping (2.1x) and Parque Arauco (5.7x), and each extra turn adds 25bp to the real cost of debt. Cash beyond the 40% payout and the capex plan is returned through buybacks or special dividends, CLP 1.8tn cumulatively over 2H26E–2031E (Appendix 5). At 3.5x the new AAA would likely come under pressure.</w:t>
+              <w:t xml:space="preserve">One liability does not show up in LTV: deferred taxes, CLP 1,313.7bn at June 2026, almost 80% of gross financial debt. They arise almost entirely from property revaluation; they are not debt to be repaid, but they show how much of the CLP 4,820.9bn book equity is appraisal rather than cash (Appendix 2). Against peers the balance sheet is conservative: LTV of 18.8% versus 42.9% at Parque Arauco and 16.3% at Cencosud Shopping, and net debt/EBITDA of 2.49x versus 5.68x and 2.11x (Appendix 6).</w:t>
             </w:r>
           </w:p>
           <w:p>
@@ -5651,7 +5636,7 @@
                 <w:sz w:val="16"/>
                 <w:szCs w:val="16"/>
               </w:rPr>
-              <w:t xml:space="preserve">One liability does not show up in LTV: deferred taxes, CLP 1,313.7bn at June 2026, almost 80% of gross financial debt. They arise almost entirely from property revaluation; they are not debt to be repaid, but they show how much of the CLP 4,820.9bn book equity is appraisal rather than cash (Appendix 2). Against peers the balance sheet is conservative: LTV of 18.8% versus 42.9% at Parque Arauco and 16.3% at Cencosud Shopping, and net debt/EBITDA of 2.49x versus 5.68x and 2.11x (Appendix 6).</w:t>
+              <w:t xml:space="preserve">Our base case spends that headroom. Net debt/EBITDA converges linearly from 2.36x to 3.5x by end-2031E, between Cencosud Shopping (2.1x) and Parque Arauco (5.7x), and each extra turn adds 25bp to the real cost of debt. Cash beyond the 40% payout and the capex plan is returned through buybacks or special dividends, CLP 1.7tn cumulatively over 2H26E–2031E (Appendix 5). At 3.5x the new AAA would likely come under pressure.</w:t>
             </w:r>
           </w:p>
           <w:p>
@@ -5686,7 +5671,7 @@
                 <w:sz w:val="16"/>
                 <w:szCs w:val="16"/>
               </w:rPr>
-              <w:t xml:space="preserve">Revenue grows 7.7% in 2026E and 5.0% in 2031E (2026E–2031E CAGR 6.4%), as real same-store growth converges to the appraisal midpoints, 123,700 m² of dated pipeline matures and, from 2029E, about 27,000 m² a year opens at the historical pace (Figure 7); 2026E and 2027E revenue sit within 0.6% of consensus. EBITDA margin stays at 79.7–79.8%, below the 2025 peak. Cash tax normalizes from 16.8% to 27% by 2030E and financial costs rise with leverage, so FFO margin slides from 60.9% to 52.2%. Working capital is held at 15.6% of revenue, the December 2025 level (Appendix 1). New GLA yields 6.9% on cost, a 5.0% real return after tax against a 7.2% real WACC: expansion adds revenue but not value.</w:t>
+              <w:t xml:space="preserve">Revenue grows 7.7% in 2026E and 5.0% in 2031E (2026E–2031E CAGR 6.9%), as real same-store growth converges to the appraisal midpoints, 170,200 m² of dated pipeline matures (including 46,500 m² of other projects in Chile opening in 2028) and, from 2029E, about 27,000 m² a year opens at the historical pace (Figure 7); 2026E revenue sits 0.3% above the BEst consensus of 13 analysts (Appendix 3C). EBITDA margin stays at 79.7–79.8%, below the 2025 peak. Cash tax (Chile's rate) normalizes from 16.8% to 27% by 2030E and financial costs rise with leverage, so FFO margin slides from 60.9% to 52.2%. Working capital is held at 15.6% of revenue, the December 2025 level (Appendix 1). New GLA yields 7.3% on cost, a 5.3% real return after tax against a 7.2% real WACC: expansion adds revenue but not value.</w:t>
             </w:r>
           </w:p>
           <w:p>
@@ -5721,7 +5706,7 @@
                 <w:sz w:val="16"/>
                 <w:szCs w:val="16"/>
               </w:rPr>
-              <w:t xml:space="preserve">The analysis leaves three conclusions for the model. First, the right earnings base is cash: we use the company's EBITDA, which removes revaluation once (Appendix 4), and distributable profit as the anchor, not the CLP 1,431bn accounting profit. Second, business quality is not in doubt: Mallplaza earns the highest normalized ROE of its local peers (9.7% against 7.8% at Parque Arauco and 8.0% at Cencosud Shopping) with an LTV of only 18.8% (Appendix 6).</w:t>
+              <w:t xml:space="preserve">The analysis leaves three conclusions for the model. First, the right earnings base is cash: we use the company's EBITDA, which removes revaluation once (Appendix 4), and distributable profit as the anchor, not the CLP 1,431bn accounting profit. Second, business quality is not in doubt: with the same adjustment for all three, Mallplaza earns the highest normalized ROE of its local peers (10.0% against 7.8% at Parque Arauco and 8.0% at Cencosud Shopping) with an LTV of 18.8% (Appendix 6).</w:t>
             </w:r>
           </w:p>
           <w:p>
@@ -5736,7 +5721,7 @@
                 <w:sz w:val="16"/>
                 <w:szCs w:val="16"/>
               </w:rPr>
-              <w:t xml:space="preserve">Third, the return on capital at fair value is low. 2025 ROIC, with NOPAT at 27% over invested capital at appraised value, was 7.3% (Appendix 3), below a 10.4% nominal WACC: the properties are worth more on the books than their cash flows justify at our rate. At the current price, 2026E FFO of CLP 428.5bn yields 5.5% on market value (18x FFO) and distributable profit 4.9%: the market is paying for these cash flows as if they were almost risk-free. That is the gap the Valuation section quantifies. In short: a high-quality business, with predictable cash and a comfortable balance sheet, whose price already discounts more than those cash flows can deliver.</w:t>
+              <w:t xml:space="preserve">Third, existing capital barely earns its cost. 2025 ROIC, with NOPAT at 27% over capital at appraised value, was 7.3%, in line with our 7.2% real WACC; the comparison is with the real rate because that ROIC excludes revaluation (Appendix 3). New capital, by contrast, earns less than its cost (RONIC of 5.3%). At the current price, 2026E FFO of CLP 428.5bn yields 5.5% on market value (18x FFO) and distributable profit 4.9%: the market is paying for these cash flows as if they were almost risk-free. That is the gap the Valuation section quantifies. In short: a high-quality business, with predictable cash and a comfortable balance sheet, whose price already discounts more than those cash flows can deliver.</w:t>
             </w:r>
           </w:p>
         </w:tc>
@@ -5968,7 +5953,7 @@
                 <w:sz w:val="14"/>
                 <w:szCs w:val="14"/>
               </w:rPr>
-              <w:t xml:space="preserve">After the pipeline, expansion keeps capex near CLP 150bn a year while leverage rebuilds to 3.5x</w:t>
+              <w:t xml:space="preserve">After the pipeline, incremental capex for continuous expansion keeps total capex near CLP 150bn a year; net debt/EBITDA rises to 3.5x</w:t>
             </w:r>
           </w:p>
           <w:p>
@@ -6028,7 +6013,7 @@
                 <w:sz w:val="11"/>
                 <w:szCs w:val="11"/>
               </w:rPr>
-              <w:t xml:space="preserve">2026E includes CLP 84.2bn spent in 1H26; 2024A leverage includes one month of Peru EBITDA. Source: Plaza S.A. financial statements (CMF); 2Q26 results release (pipeline); valuation base case (Appendices 1 and 5).</w:t>
+              <w:t xml:space="preserve">2026E includes CLP 84.2bn of 1H26 (no breakdown by type). Maintenance + IT = 5.5% of revenue; incremental = pipeline under way + continuous expansion. 2024A: one month of Peru EBITDA. Source: Plaza S.A. financial statements (CMF); 2Q26 results release; model v4 (Appendix [B]).</w:t>
             </w:r>
           </w:p>
         </w:tc>

</xml_diff>